<commit_message>
added device battery power methods to working notes temp
</commit_message>
<xml_diff>
--- a/documentation/working notes/working notes temp.docx
+++ b/documentation/working notes/working notes temp.docx
@@ -1,6 +1,6 @@
 
 <file path=word/document.xml><?xml version="1.0" encoding="utf-8"?>
-<w:document xmlns:wpc="http://schemas.microsoft.com/office/word/2010/wordprocessingCanvas" xmlns:cx="http://schemas.microsoft.com/office/drawing/2014/chartex" xmlns:cx1="http://schemas.microsoft.com/office/drawing/2015/9/8/chartex" xmlns:cx2="http://schemas.microsoft.com/office/drawing/2015/10/21/chartex" xmlns:cx3="http://schemas.microsoft.com/office/drawing/2016/5/9/chartex" xmlns:cx4="http://schemas.microsoft.com/office/drawing/2016/5/10/chartex" xmlns:cx5="http://schemas.microsoft.com/office/drawing/2016/5/11/chartex" xmlns:cx6="http://schemas.microsoft.com/office/drawing/2016/5/12/chartex" xmlns:cx7="http://schemas.microsoft.com/office/drawing/2016/5/13/chartex" xmlns:cx8="http://schemas.microsoft.com/office/drawing/2016/5/14/chartex" xmlns:mc="http://schemas.openxmlformats.org/markup-compatibility/2006" xmlns:aink="http://schemas.microsoft.com/office/drawing/2016/ink" xmlns:am3d="http://schemas.microsoft.com/office/drawing/2017/model3d" xmlns:o="urn:schemas-microsoft-com:office:office" xmlns:oel="http://schemas.microsoft.com/office/2019/extlst" xmlns:r="http://schemas.openxmlformats.org/officeDocument/2006/relationships" xmlns:m="http://schemas.openxmlformats.org/officeDocument/2006/math" xmlns:v="urn:schemas-microsoft-com:vml" xmlns:wp14="http://schemas.microsoft.com/office/word/2010/wordprocessingDrawing" xmlns:wp="http://schemas.openxmlformats.org/drawingml/2006/wordprocessingDrawing" xmlns:w10="urn:schemas-microsoft-com:office:word" xmlns:w="http://schemas.openxmlformats.org/wordprocessingml/2006/main" xmlns:w14="http://schemas.microsoft.com/office/word/2010/wordml" xmlns:w15="http://schemas.microsoft.com/office/word/2012/wordml" xmlns:w16cei="http://schemas.microsoft.com/office/word/2026/wordml/cei" xmlns:w16cex="http://schemas.microsoft.com/office/word/2018/wordml/cex" xmlns:w16cid="http://schemas.microsoft.com/office/word/2016/wordml/cid" xmlns:w16="http://schemas.microsoft.com/office/word/2018/wordml" xmlns:w16du="http://schemas.microsoft.com/office/word/2023/wordml/word16du" xmlns:w16sdtdh="http://schemas.microsoft.com/office/word/2020/wordml/sdtdatahash" xmlns:w16sdtfl="http://schemas.microsoft.com/office/word/2024/wordml/sdtformatlock" xmlns:w16se="http://schemas.microsoft.com/office/word/2015/wordml/symex" xmlns:wpg="http://schemas.microsoft.com/office/word/2010/wordprocessingGroup" xmlns:wpi="http://schemas.microsoft.com/office/word/2010/wordprocessingInk" xmlns:wne="http://schemas.microsoft.com/office/word/2006/wordml" xmlns:wps="http://schemas.microsoft.com/office/word/2010/wordprocessingShape" mc:Ignorable="w14 w15 w16se w16cid w16 w16cex w16sdtdh w16sdtfl w16du wp14">
+<w:document xmlns:wpc="http://schemas.microsoft.com/office/word/2010/wordprocessingCanvas" xmlns:cx="http://schemas.microsoft.com/office/drawing/2014/chartex" xmlns:cx1="http://schemas.microsoft.com/office/drawing/2015/9/8/chartex" xmlns:cx2="http://schemas.microsoft.com/office/drawing/2015/10/21/chartex" xmlns:cx3="http://schemas.microsoft.com/office/drawing/2016/5/9/chartex" xmlns:cx4="http://schemas.microsoft.com/office/drawing/2016/5/10/chartex" xmlns:cx5="http://schemas.microsoft.com/office/drawing/2016/5/11/chartex" xmlns:cx6="http://schemas.microsoft.com/office/drawing/2016/5/12/chartex" xmlns:cx7="http://schemas.microsoft.com/office/drawing/2016/5/13/chartex" xmlns:cx8="http://schemas.microsoft.com/office/drawing/2016/5/14/chartex" xmlns:mc="http://schemas.openxmlformats.org/markup-compatibility/2006" xmlns:aink="http://schemas.microsoft.com/office/drawing/2016/ink" xmlns:am3d="http://schemas.microsoft.com/office/drawing/2017/model3d" xmlns:o="urn:schemas-microsoft-com:office:office" xmlns:oel="http://schemas.microsoft.com/office/2019/extlst" xmlns:r="http://schemas.openxmlformats.org/officeDocument/2006/relationships" xmlns:m="http://schemas.openxmlformats.org/officeDocument/2006/math" xmlns:v="urn:schemas-microsoft-com:vml" xmlns:wp14="http://schemas.microsoft.com/office/word/2010/wordprocessingDrawing" xmlns:wp="http://schemas.openxmlformats.org/drawingml/2006/wordprocessingDrawing" xmlns:w10="urn:schemas-microsoft-com:office:word" xmlns:w="http://schemas.openxmlformats.org/wordprocessingml/2006/main" xmlns:w14="http://schemas.microsoft.com/office/word/2010/wordml" xmlns:w15="http://schemas.microsoft.com/office/word/2012/wordml" xmlns:w16cex="http://schemas.microsoft.com/office/word/2018/wordml/cex" xmlns:w16cid="http://schemas.microsoft.com/office/word/2016/wordml/cid" xmlns:w16="http://schemas.microsoft.com/office/word/2018/wordml" xmlns:w16du="http://schemas.microsoft.com/office/word/2023/wordml/word16du" xmlns:w16sdtdh="http://schemas.microsoft.com/office/word/2020/wordml/sdtdatahash" xmlns:w16sdtfl="http://schemas.microsoft.com/office/word/2024/wordml/sdtformatlock" xmlns:w16se="http://schemas.microsoft.com/office/word/2015/wordml/symex" xmlns:wpg="http://schemas.microsoft.com/office/word/2010/wordprocessingGroup" xmlns:wpi="http://schemas.microsoft.com/office/word/2010/wordprocessingInk" xmlns:wne="http://schemas.microsoft.com/office/word/2006/wordml" xmlns:wps="http://schemas.microsoft.com/office/word/2010/wordprocessingShape" mc:Ignorable="w14 w15 w16se w16cid w16 w16cex w16sdtdh w16sdtfl w16du wp14">
   <w:body>
     <w:p>
       <w:r>
@@ -488,6 +488,28 @@
       </w:r>
       <w:r>
         <w:t xml:space="preserve"> -&gt; state is checked some way, whether through a loop or through checking the input of each switch somehow.</w:t>
+      </w:r>
+    </w:p>
+    <w:p/>
+    <w:p>
+      <w:pPr>
+        <w:rPr>
+          <w:u w:val="single"/>
+        </w:rPr>
+      </w:pPr>
+      <w:r>
+        <w:rPr>
+          <w:u w:val="single"/>
+        </w:rPr>
+        <w:t>Hardware Power</w:t>
+      </w:r>
+    </w:p>
+    <w:p>
+      <w:r>
+        <w:t>DC-DC boost converter module to boost 3.7/3.2 V lithium-ion battery to 7-12 V for the purpose of powering the ESP32. If power is lost (whether a safety mechanism to switch power off or otherwise), then a slow discharge</w:t>
+      </w:r>
+      <w:r>
+        <w:t xml:space="preserve"> and voltage divider analogue in + interrupt as well as/or a brownout detector to set a all switched to open before the ESP32 becomes fully unpowered.</w:t>
       </w:r>
     </w:p>
     <w:sectPr>
@@ -501,7 +523,7 @@
 </file>
 
 <file path=word/numbering.xml><?xml version="1.0" encoding="utf-8"?>
-<w:numbering xmlns:wpc="http://schemas.microsoft.com/office/word/2010/wordprocessingCanvas" xmlns:cx="http://schemas.microsoft.com/office/drawing/2014/chartex" xmlns:cx1="http://schemas.microsoft.com/office/drawing/2015/9/8/chartex" xmlns:cx2="http://schemas.microsoft.com/office/drawing/2015/10/21/chartex" xmlns:cx3="http://schemas.microsoft.com/office/drawing/2016/5/9/chartex" xmlns:cx4="http://schemas.microsoft.com/office/drawing/2016/5/10/chartex" xmlns:cx5="http://schemas.microsoft.com/office/drawing/2016/5/11/chartex" xmlns:cx6="http://schemas.microsoft.com/office/drawing/2016/5/12/chartex" xmlns:cx7="http://schemas.microsoft.com/office/drawing/2016/5/13/chartex" xmlns:cx8="http://schemas.microsoft.com/office/drawing/2016/5/14/chartex" xmlns:mc="http://schemas.openxmlformats.org/markup-compatibility/2006" xmlns:aink="http://schemas.microsoft.com/office/drawing/2016/ink" xmlns:am3d="http://schemas.microsoft.com/office/drawing/2017/model3d" xmlns:o="urn:schemas-microsoft-com:office:office" xmlns:oel="http://schemas.microsoft.com/office/2019/extlst" xmlns:r="http://schemas.openxmlformats.org/officeDocument/2006/relationships" xmlns:m="http://schemas.openxmlformats.org/officeDocument/2006/math" xmlns:v="urn:schemas-microsoft-com:vml" xmlns:wp14="http://schemas.microsoft.com/office/word/2010/wordprocessingDrawing" xmlns:wp="http://schemas.openxmlformats.org/drawingml/2006/wordprocessingDrawing" xmlns:w10="urn:schemas-microsoft-com:office:word" xmlns:w="http://schemas.openxmlformats.org/wordprocessingml/2006/main" xmlns:w14="http://schemas.microsoft.com/office/word/2010/wordml" xmlns:w15="http://schemas.microsoft.com/office/word/2012/wordml" xmlns:w16cei="http://schemas.microsoft.com/office/word/2026/wordml/cei" xmlns:w16cex="http://schemas.microsoft.com/office/word/2018/wordml/cex" xmlns:w16cid="http://schemas.microsoft.com/office/word/2016/wordml/cid" xmlns:w16="http://schemas.microsoft.com/office/word/2018/wordml" xmlns:w16du="http://schemas.microsoft.com/office/word/2023/wordml/word16du" xmlns:w16sdtdh="http://schemas.microsoft.com/office/word/2020/wordml/sdtdatahash" xmlns:w16sdtfl="http://schemas.microsoft.com/office/word/2024/wordml/sdtformatlock" xmlns:w16se="http://schemas.microsoft.com/office/word/2015/wordml/symex" xmlns:wpg="http://schemas.microsoft.com/office/word/2010/wordprocessingGroup" xmlns:wpi="http://schemas.microsoft.com/office/word/2010/wordprocessingInk" xmlns:wne="http://schemas.microsoft.com/office/word/2006/wordml" xmlns:wps="http://schemas.microsoft.com/office/word/2010/wordprocessingShape" mc:Ignorable="w14 w15 w16se w16cid w16 w16cex w16sdtdh w16sdtfl w16du wp14">
+<w:numbering xmlns:wpc="http://schemas.microsoft.com/office/word/2010/wordprocessingCanvas" xmlns:cx="http://schemas.microsoft.com/office/drawing/2014/chartex" xmlns:cx1="http://schemas.microsoft.com/office/drawing/2015/9/8/chartex" xmlns:cx2="http://schemas.microsoft.com/office/drawing/2015/10/21/chartex" xmlns:cx3="http://schemas.microsoft.com/office/drawing/2016/5/9/chartex" xmlns:cx4="http://schemas.microsoft.com/office/drawing/2016/5/10/chartex" xmlns:cx5="http://schemas.microsoft.com/office/drawing/2016/5/11/chartex" xmlns:cx6="http://schemas.microsoft.com/office/drawing/2016/5/12/chartex" xmlns:cx7="http://schemas.microsoft.com/office/drawing/2016/5/13/chartex" xmlns:cx8="http://schemas.microsoft.com/office/drawing/2016/5/14/chartex" xmlns:mc="http://schemas.openxmlformats.org/markup-compatibility/2006" xmlns:aink="http://schemas.microsoft.com/office/drawing/2016/ink" xmlns:am3d="http://schemas.microsoft.com/office/drawing/2017/model3d" xmlns:o="urn:schemas-microsoft-com:office:office" xmlns:oel="http://schemas.microsoft.com/office/2019/extlst" xmlns:r="http://schemas.openxmlformats.org/officeDocument/2006/relationships" xmlns:m="http://schemas.openxmlformats.org/officeDocument/2006/math" xmlns:v="urn:schemas-microsoft-com:vml" xmlns:wp14="http://schemas.microsoft.com/office/word/2010/wordprocessingDrawing" xmlns:wp="http://schemas.openxmlformats.org/drawingml/2006/wordprocessingDrawing" xmlns:w10="urn:schemas-microsoft-com:office:word" xmlns:w="http://schemas.openxmlformats.org/wordprocessingml/2006/main" xmlns:w14="http://schemas.microsoft.com/office/word/2010/wordml" xmlns:w15="http://schemas.microsoft.com/office/word/2012/wordml" xmlns:w16cex="http://schemas.microsoft.com/office/word/2018/wordml/cex" xmlns:w16cid="http://schemas.microsoft.com/office/word/2016/wordml/cid" xmlns:w16="http://schemas.microsoft.com/office/word/2018/wordml" xmlns:w16du="http://schemas.microsoft.com/office/word/2023/wordml/word16du" xmlns:w16sdtdh="http://schemas.microsoft.com/office/word/2020/wordml/sdtdatahash" xmlns:w16sdtfl="http://schemas.microsoft.com/office/word/2024/wordml/sdtformatlock" xmlns:w16se="http://schemas.microsoft.com/office/word/2015/wordml/symex" xmlns:wpg="http://schemas.microsoft.com/office/word/2010/wordprocessingGroup" xmlns:wpi="http://schemas.microsoft.com/office/word/2010/wordprocessingInk" xmlns:wne="http://schemas.microsoft.com/office/word/2006/wordml" xmlns:wps="http://schemas.microsoft.com/office/word/2010/wordprocessingShape" mc:Ignorable="w14 w15 w16se w16cid w16 w16cex w16sdtdh w16sdtfl w16du wp14">
   <w:abstractNum w:abstractNumId="0" w15:restartNumberingAfterBreak="0">
     <w:nsid w:val="48C15723"/>
     <w:multiLevelType w:val="hybridMultilevel"/>

</xml_diff>

<commit_message>
added embedded test device hardware error detection thoughts/considerations to temporary working notes
</commit_message>
<xml_diff>
--- a/documentation/working notes/working notes temp.docx
+++ b/documentation/working notes/working notes temp.docx
@@ -488,6 +488,26 @@
       </w:r>
       <w:r>
         <w:t xml:space="preserve"> -&gt; state is checked some way, whether through a loop or through checking the input of each switch somehow.</w:t>
+      </w:r>
+    </w:p>
+    <w:p/>
+    <w:p>
+      <w:r>
+        <w:t>Embedded system error messaging detection:</w:t>
+      </w:r>
+    </w:p>
+    <w:p>
+      <w:r>
+        <w:t>The program should be able to record reading mismatches between host and MCU. Runtime records should be implemented to keep track of which electrical paths the mismatch in expected vs hardware measured data comes from, ex., if card output switch 3 was closed and was connected to current to voltage conversion circuit, then it should keep track of such information. Reasoning behind is so that if further records of the same conversion circuit connected to other output switches provide a fail</w:t>
+      </w:r>
+      <w:r>
+        <w:t xml:space="preserve">ed measurement </w:t>
+      </w:r>
+      <w:r>
+        <w:t xml:space="preserve">state then it is most likely a hardware failure associated with the particular circuit. If other output switches being connected to the circuit aren’t </w:t>
+      </w:r>
+      <w:r>
+        <w:t>providing a failed measurement state then it is most likely an issue with the output switch or the card’s output itself.</w:t>
       </w:r>
     </w:p>
     <w:p/>

</xml_diff>